<commit_message>
Camada 2: mais 11 documentos oficiais do CFESS (39 no total); atividade nº 10 atualizada
Co-Authored-By: Claude Opus 5.5 <noreply@anthropic.com>
</commit_message>
<xml_diff>
--- a/docs/revisao/Atividade_10_Avaliacao_da_IA.docx
+++ b/docs/revisao/Atividade_10_Avaliacao_da_IA.docx
@@ -3971,6 +3971,1260 @@
                 <w:szCs w:val="20"/>
               </w:rPr>
               <w:t xml:space="preserve">6 p. / 33</w:t>
+            </w:r>
+          </w:p>
+        </w:tc>
+        <w:tc>
+          <w:tcPr>
+            <w:tcW w:type="dxa" w:w="2138"/>
+            <w:tcBorders>
+              <w:top w:val="single" w:color="B9C4D0" w:sz="4"/>
+              <w:left w:val="single" w:color="B9C4D0" w:sz="4"/>
+              <w:bottom w:val="single" w:color="B9C4D0" w:sz="4"/>
+              <w:right w:val="single" w:color="B9C4D0" w:sz="4"/>
+            </w:tcBorders>
+            <w:shd w:fill="F2F6FB" w:color="auto" w:val="clear"/>
+            <w:tcMar>
+              <w:top w:type="dxa" w:w="60"/>
+              <w:left w:type="dxa" w:w="100"/>
+              <w:bottom w:type="dxa" w:w="60"/>
+              <w:right w:type="dxa" w:w="100"/>
+            </w:tcMar>
+          </w:tcPr>
+          <w:p>
+            <w:r>
+              <w:rPr>
+                <w:rFonts w:ascii="Calibri" w:cs="Calibri" w:eastAsia="Calibri" w:hAnsi="Calibri"/>
+                <w:sz w:val="20"/>
+                <w:szCs w:val="20"/>
+              </w:rPr>
+              <w:t xml:space="preserve">☐ Incluir   ☐ Não incluir</w:t>
+            </w:r>
+          </w:p>
+        </w:tc>
+      </w:tr>
+      <w:tr>
+        <w:trPr>
+          <w:cantSplit/>
+        </w:trPr>
+        <w:tc>
+          <w:tcPr>
+            <w:tcW w:type="dxa" w:w="500"/>
+            <w:tcBorders>
+              <w:top w:val="single" w:color="B9C4D0" w:sz="4"/>
+              <w:left w:val="single" w:color="B9C4D0" w:sz="4"/>
+              <w:bottom w:val="single" w:color="B9C4D0" w:sz="4"/>
+              <w:right w:val="single" w:color="B9C4D0" w:sz="4"/>
+            </w:tcBorders>
+            <w:tcMar>
+              <w:top w:type="dxa" w:w="60"/>
+              <w:left w:type="dxa" w:w="100"/>
+              <w:bottom w:type="dxa" w:w="60"/>
+              <w:right w:type="dxa" w:w="100"/>
+            </w:tcMar>
+          </w:tcPr>
+          <w:p>
+            <w:r>
+              <w:rPr>
+                <w:rFonts w:ascii="Calibri" w:cs="Calibri" w:eastAsia="Calibri" w:hAnsi="Calibri"/>
+                <w:sz w:val="20"/>
+                <w:szCs w:val="20"/>
+              </w:rPr>
+              <w:t xml:space="preserve">29</w:t>
+            </w:r>
+          </w:p>
+        </w:tc>
+        <w:tc>
+          <w:tcPr>
+            <w:tcW w:type="dxa" w:w="5600"/>
+            <w:tcBorders>
+              <w:top w:val="single" w:color="B9C4D0" w:sz="4"/>
+              <w:left w:val="single" w:color="B9C4D0" w:sz="4"/>
+              <w:bottom w:val="single" w:color="B9C4D0" w:sz="4"/>
+              <w:right w:val="single" w:color="B9C4D0" w:sz="4"/>
+            </w:tcBorders>
+            <w:tcMar>
+              <w:top w:type="dxa" w:w="60"/>
+              <w:left w:type="dxa" w:w="100"/>
+              <w:bottom w:type="dxa" w:w="60"/>
+              <w:right w:type="dxa" w:w="100"/>
+            </w:tcMar>
+          </w:tcPr>
+          <w:p>
+            <w:r>
+              <w:rPr>
+                <w:rFonts w:ascii="Calibri" w:cs="Calibri" w:eastAsia="Calibri" w:hAnsi="Calibri"/>
+                <w:sz w:val="20"/>
+                <w:szCs w:val="20"/>
+              </w:rPr>
+              <w:t xml:space="preserve">CFESS. O estigma do uso de drogas (Série Assistente Social no Combate ao Preconceito, caderno 2). 2016.</w:t>
+            </w:r>
+          </w:p>
+        </w:tc>
+        <w:tc>
+          <w:tcPr>
+            <w:tcW w:type="dxa" w:w="1400"/>
+            <w:tcBorders>
+              <w:top w:val="single" w:color="B9C4D0" w:sz="4"/>
+              <w:left w:val="single" w:color="B9C4D0" w:sz="4"/>
+              <w:bottom w:val="single" w:color="B9C4D0" w:sz="4"/>
+              <w:right w:val="single" w:color="B9C4D0" w:sz="4"/>
+            </w:tcBorders>
+            <w:tcMar>
+              <w:top w:type="dxa" w:w="60"/>
+              <w:left w:type="dxa" w:w="100"/>
+              <w:bottom w:type="dxa" w:w="60"/>
+              <w:right w:type="dxa" w:w="100"/>
+            </w:tcMar>
+          </w:tcPr>
+          <w:p>
+            <w:r>
+              <w:rPr>
+                <w:rFonts w:ascii="Calibri" w:cs="Calibri" w:eastAsia="Calibri" w:hAnsi="Calibri"/>
+                <w:sz w:val="20"/>
+                <w:szCs w:val="20"/>
+              </w:rPr>
+              <w:t xml:space="preserve">18 p. / 33</w:t>
+            </w:r>
+          </w:p>
+        </w:tc>
+        <w:tc>
+          <w:tcPr>
+            <w:tcW w:type="dxa" w:w="2138"/>
+            <w:tcBorders>
+              <w:top w:val="single" w:color="B9C4D0" w:sz="4"/>
+              <w:left w:val="single" w:color="B9C4D0" w:sz="4"/>
+              <w:bottom w:val="single" w:color="B9C4D0" w:sz="4"/>
+              <w:right w:val="single" w:color="B9C4D0" w:sz="4"/>
+            </w:tcBorders>
+            <w:shd w:fill="F2F6FB" w:color="auto" w:val="clear"/>
+            <w:tcMar>
+              <w:top w:type="dxa" w:w="60"/>
+              <w:left w:type="dxa" w:w="100"/>
+              <w:bottom w:type="dxa" w:w="60"/>
+              <w:right w:type="dxa" w:w="100"/>
+            </w:tcMar>
+          </w:tcPr>
+          <w:p>
+            <w:r>
+              <w:rPr>
+                <w:rFonts w:ascii="Calibri" w:cs="Calibri" w:eastAsia="Calibri" w:hAnsi="Calibri"/>
+                <w:sz w:val="20"/>
+                <w:szCs w:val="20"/>
+              </w:rPr>
+              <w:t xml:space="preserve">☐ Incluir   ☐ Não incluir</w:t>
+            </w:r>
+          </w:p>
+        </w:tc>
+      </w:tr>
+      <w:tr>
+        <w:trPr>
+          <w:cantSplit/>
+        </w:trPr>
+        <w:tc>
+          <w:tcPr>
+            <w:tcW w:type="dxa" w:w="500"/>
+            <w:tcBorders>
+              <w:top w:val="single" w:color="B9C4D0" w:sz="4"/>
+              <w:left w:val="single" w:color="B9C4D0" w:sz="4"/>
+              <w:bottom w:val="single" w:color="B9C4D0" w:sz="4"/>
+              <w:right w:val="single" w:color="B9C4D0" w:sz="4"/>
+            </w:tcBorders>
+            <w:tcMar>
+              <w:top w:type="dxa" w:w="60"/>
+              <w:left w:type="dxa" w:w="100"/>
+              <w:bottom w:type="dxa" w:w="60"/>
+              <w:right w:type="dxa" w:w="100"/>
+            </w:tcMar>
+          </w:tcPr>
+          <w:p>
+            <w:r>
+              <w:rPr>
+                <w:rFonts w:ascii="Calibri" w:cs="Calibri" w:eastAsia="Calibri" w:hAnsi="Calibri"/>
+                <w:sz w:val="20"/>
+                <w:szCs w:val="20"/>
+              </w:rPr>
+              <w:t xml:space="preserve">30</w:t>
+            </w:r>
+          </w:p>
+        </w:tc>
+        <w:tc>
+          <w:tcPr>
+            <w:tcW w:type="dxa" w:w="5600"/>
+            <w:tcBorders>
+              <w:top w:val="single" w:color="B9C4D0" w:sz="4"/>
+              <w:left w:val="single" w:color="B9C4D0" w:sz="4"/>
+              <w:bottom w:val="single" w:color="B9C4D0" w:sz="4"/>
+              <w:right w:val="single" w:color="B9C4D0" w:sz="4"/>
+            </w:tcBorders>
+            <w:tcMar>
+              <w:top w:type="dxa" w:w="60"/>
+              <w:left w:type="dxa" w:w="100"/>
+              <w:bottom w:type="dxa" w:w="60"/>
+              <w:right w:type="dxa" w:w="100"/>
+            </w:tcMar>
+          </w:tcPr>
+          <w:p>
+            <w:r>
+              <w:rPr>
+                <w:rFonts w:ascii="Calibri" w:cs="Calibri" w:eastAsia="Calibri" w:hAnsi="Calibri"/>
+                <w:sz w:val="20"/>
+                <w:szCs w:val="20"/>
+              </w:rPr>
+              <w:t xml:space="preserve">CFESS. Xenofobia (Série Assistente Social no Combate ao Preconceito, caderno 5). 2016.</w:t>
+            </w:r>
+          </w:p>
+        </w:tc>
+        <w:tc>
+          <w:tcPr>
+            <w:tcW w:type="dxa" w:w="1400"/>
+            <w:tcBorders>
+              <w:top w:val="single" w:color="B9C4D0" w:sz="4"/>
+              <w:left w:val="single" w:color="B9C4D0" w:sz="4"/>
+              <w:bottom w:val="single" w:color="B9C4D0" w:sz="4"/>
+              <w:right w:val="single" w:color="B9C4D0" w:sz="4"/>
+            </w:tcBorders>
+            <w:tcMar>
+              <w:top w:type="dxa" w:w="60"/>
+              <w:left w:type="dxa" w:w="100"/>
+              <w:bottom w:type="dxa" w:w="60"/>
+              <w:right w:type="dxa" w:w="100"/>
+            </w:tcMar>
+          </w:tcPr>
+          <w:p>
+            <w:r>
+              <w:rPr>
+                <w:rFonts w:ascii="Calibri" w:cs="Calibri" w:eastAsia="Calibri" w:hAnsi="Calibri"/>
+                <w:sz w:val="20"/>
+                <w:szCs w:val="20"/>
+              </w:rPr>
+              <w:t xml:space="preserve">22 p. / 47</w:t>
+            </w:r>
+          </w:p>
+        </w:tc>
+        <w:tc>
+          <w:tcPr>
+            <w:tcW w:type="dxa" w:w="2138"/>
+            <w:tcBorders>
+              <w:top w:val="single" w:color="B9C4D0" w:sz="4"/>
+              <w:left w:val="single" w:color="B9C4D0" w:sz="4"/>
+              <w:bottom w:val="single" w:color="B9C4D0" w:sz="4"/>
+              <w:right w:val="single" w:color="B9C4D0" w:sz="4"/>
+            </w:tcBorders>
+            <w:shd w:fill="F2F6FB" w:color="auto" w:val="clear"/>
+            <w:tcMar>
+              <w:top w:type="dxa" w:w="60"/>
+              <w:left w:type="dxa" w:w="100"/>
+              <w:bottom w:type="dxa" w:w="60"/>
+              <w:right w:type="dxa" w:w="100"/>
+            </w:tcMar>
+          </w:tcPr>
+          <w:p>
+            <w:r>
+              <w:rPr>
+                <w:rFonts w:ascii="Calibri" w:cs="Calibri" w:eastAsia="Calibri" w:hAnsi="Calibri"/>
+                <w:sz w:val="20"/>
+                <w:szCs w:val="20"/>
+              </w:rPr>
+              <w:t xml:space="preserve">☐ Incluir   ☐ Não incluir</w:t>
+            </w:r>
+          </w:p>
+        </w:tc>
+      </w:tr>
+      <w:tr>
+        <w:trPr>
+          <w:cantSplit/>
+        </w:trPr>
+        <w:tc>
+          <w:tcPr>
+            <w:tcW w:type="dxa" w:w="500"/>
+            <w:tcBorders>
+              <w:top w:val="single" w:color="B9C4D0" w:sz="4"/>
+              <w:left w:val="single" w:color="B9C4D0" w:sz="4"/>
+              <w:bottom w:val="single" w:color="B9C4D0" w:sz="4"/>
+              <w:right w:val="single" w:color="B9C4D0" w:sz="4"/>
+            </w:tcBorders>
+            <w:tcMar>
+              <w:top w:type="dxa" w:w="60"/>
+              <w:left w:type="dxa" w:w="100"/>
+              <w:bottom w:type="dxa" w:w="60"/>
+              <w:right w:type="dxa" w:w="100"/>
+            </w:tcMar>
+          </w:tcPr>
+          <w:p>
+            <w:r>
+              <w:rPr>
+                <w:rFonts w:ascii="Calibri" w:cs="Calibri" w:eastAsia="Calibri" w:hAnsi="Calibri"/>
+                <w:sz w:val="20"/>
+                <w:szCs w:val="20"/>
+              </w:rPr>
+              <w:t xml:space="preserve">31</w:t>
+            </w:r>
+          </w:p>
+        </w:tc>
+        <w:tc>
+          <w:tcPr>
+            <w:tcW w:type="dxa" w:w="5600"/>
+            <w:tcBorders>
+              <w:top w:val="single" w:color="B9C4D0" w:sz="4"/>
+              <w:left w:val="single" w:color="B9C4D0" w:sz="4"/>
+              <w:bottom w:val="single" w:color="B9C4D0" w:sz="4"/>
+              <w:right w:val="single" w:color="B9C4D0" w:sz="4"/>
+            </w:tcBorders>
+            <w:tcMar>
+              <w:top w:type="dxa" w:w="60"/>
+              <w:left w:type="dxa" w:w="100"/>
+              <w:bottom w:type="dxa" w:w="60"/>
+              <w:right w:type="dxa" w:w="100"/>
+            </w:tcMar>
+          </w:tcPr>
+          <w:p>
+            <w:r>
+              <w:rPr>
+                <w:rFonts w:ascii="Calibri" w:cs="Calibri" w:eastAsia="Calibri" w:hAnsi="Calibri"/>
+                <w:sz w:val="20"/>
+                <w:szCs w:val="20"/>
+              </w:rPr>
+              <w:t xml:space="preserve">CFESS. Machismo (Série Assistente Social no Combate ao Preconceito, caderno 6). 2019.</w:t>
+            </w:r>
+          </w:p>
+        </w:tc>
+        <w:tc>
+          <w:tcPr>
+            <w:tcW w:type="dxa" w:w="1400"/>
+            <w:tcBorders>
+              <w:top w:val="single" w:color="B9C4D0" w:sz="4"/>
+              <w:left w:val="single" w:color="B9C4D0" w:sz="4"/>
+              <w:bottom w:val="single" w:color="B9C4D0" w:sz="4"/>
+              <w:right w:val="single" w:color="B9C4D0" w:sz="4"/>
+            </w:tcBorders>
+            <w:tcMar>
+              <w:top w:type="dxa" w:w="60"/>
+              <w:left w:type="dxa" w:w="100"/>
+              <w:bottom w:type="dxa" w:w="60"/>
+              <w:right w:type="dxa" w:w="100"/>
+            </w:tcMar>
+          </w:tcPr>
+          <w:p>
+            <w:r>
+              <w:rPr>
+                <w:rFonts w:ascii="Calibri" w:cs="Calibri" w:eastAsia="Calibri" w:hAnsi="Calibri"/>
+                <w:sz w:val="20"/>
+                <w:szCs w:val="20"/>
+              </w:rPr>
+              <w:t xml:space="preserve">26 p. / 69</w:t>
+            </w:r>
+          </w:p>
+        </w:tc>
+        <w:tc>
+          <w:tcPr>
+            <w:tcW w:type="dxa" w:w="2138"/>
+            <w:tcBorders>
+              <w:top w:val="single" w:color="B9C4D0" w:sz="4"/>
+              <w:left w:val="single" w:color="B9C4D0" w:sz="4"/>
+              <w:bottom w:val="single" w:color="B9C4D0" w:sz="4"/>
+              <w:right w:val="single" w:color="B9C4D0" w:sz="4"/>
+            </w:tcBorders>
+            <w:shd w:fill="F2F6FB" w:color="auto" w:val="clear"/>
+            <w:tcMar>
+              <w:top w:type="dxa" w:w="60"/>
+              <w:left w:type="dxa" w:w="100"/>
+              <w:bottom w:type="dxa" w:w="60"/>
+              <w:right w:type="dxa" w:w="100"/>
+            </w:tcMar>
+          </w:tcPr>
+          <w:p>
+            <w:r>
+              <w:rPr>
+                <w:rFonts w:ascii="Calibri" w:cs="Calibri" w:eastAsia="Calibri" w:hAnsi="Calibri"/>
+                <w:sz w:val="20"/>
+                <w:szCs w:val="20"/>
+              </w:rPr>
+              <w:t xml:space="preserve">☐ Incluir   ☐ Não incluir</w:t>
+            </w:r>
+          </w:p>
+        </w:tc>
+      </w:tr>
+      <w:tr>
+        <w:trPr>
+          <w:cantSplit/>
+        </w:trPr>
+        <w:tc>
+          <w:tcPr>
+            <w:tcW w:type="dxa" w:w="500"/>
+            <w:tcBorders>
+              <w:top w:val="single" w:color="B9C4D0" w:sz="4"/>
+              <w:left w:val="single" w:color="B9C4D0" w:sz="4"/>
+              <w:bottom w:val="single" w:color="B9C4D0" w:sz="4"/>
+              <w:right w:val="single" w:color="B9C4D0" w:sz="4"/>
+            </w:tcBorders>
+            <w:tcMar>
+              <w:top w:type="dxa" w:w="60"/>
+              <w:left w:type="dxa" w:w="100"/>
+              <w:bottom w:type="dxa" w:w="60"/>
+              <w:right w:type="dxa" w:w="100"/>
+            </w:tcMar>
+          </w:tcPr>
+          <w:p>
+            <w:r>
+              <w:rPr>
+                <w:rFonts w:ascii="Calibri" w:cs="Calibri" w:eastAsia="Calibri" w:hAnsi="Calibri"/>
+                <w:sz w:val="20"/>
+                <w:szCs w:val="20"/>
+              </w:rPr>
+              <w:t xml:space="preserve">32</w:t>
+            </w:r>
+          </w:p>
+        </w:tc>
+        <w:tc>
+          <w:tcPr>
+            <w:tcW w:type="dxa" w:w="5600"/>
+            <w:tcBorders>
+              <w:top w:val="single" w:color="B9C4D0" w:sz="4"/>
+              <w:left w:val="single" w:color="B9C4D0" w:sz="4"/>
+              <w:bottom w:val="single" w:color="B9C4D0" w:sz="4"/>
+              <w:right w:val="single" w:color="B9C4D0" w:sz="4"/>
+            </w:tcBorders>
+            <w:tcMar>
+              <w:top w:type="dxa" w:w="60"/>
+              <w:left w:type="dxa" w:w="100"/>
+              <w:bottom w:type="dxa" w:w="60"/>
+              <w:right w:type="dxa" w:w="100"/>
+            </w:tcMar>
+          </w:tcPr>
+          <w:p>
+            <w:r>
+              <w:rPr>
+                <w:rFonts w:ascii="Calibri" w:cs="Calibri" w:eastAsia="Calibri" w:hAnsi="Calibri"/>
+                <w:sz w:val="20"/>
+                <w:szCs w:val="20"/>
+              </w:rPr>
+              <w:t xml:space="preserve">CFESS. Discriminação contra a população usuária da saúde mental (Série Assistente Social no Combate ao Preconceito, caderno 8). 2022.</w:t>
+            </w:r>
+          </w:p>
+        </w:tc>
+        <w:tc>
+          <w:tcPr>
+            <w:tcW w:type="dxa" w:w="1400"/>
+            <w:tcBorders>
+              <w:top w:val="single" w:color="B9C4D0" w:sz="4"/>
+              <w:left w:val="single" w:color="B9C4D0" w:sz="4"/>
+              <w:bottom w:val="single" w:color="B9C4D0" w:sz="4"/>
+              <w:right w:val="single" w:color="B9C4D0" w:sz="4"/>
+            </w:tcBorders>
+            <w:tcMar>
+              <w:top w:type="dxa" w:w="60"/>
+              <w:left w:type="dxa" w:w="100"/>
+              <w:bottom w:type="dxa" w:w="60"/>
+              <w:right w:type="dxa" w:w="100"/>
+            </w:tcMar>
+          </w:tcPr>
+          <w:p>
+            <w:r>
+              <w:rPr>
+                <w:rFonts w:ascii="Calibri" w:cs="Calibri" w:eastAsia="Calibri" w:hAnsi="Calibri"/>
+                <w:sz w:val="20"/>
+                <w:szCs w:val="20"/>
+              </w:rPr>
+              <w:t xml:space="preserve">24 p. / 62</w:t>
+            </w:r>
+          </w:p>
+        </w:tc>
+        <w:tc>
+          <w:tcPr>
+            <w:tcW w:type="dxa" w:w="2138"/>
+            <w:tcBorders>
+              <w:top w:val="single" w:color="B9C4D0" w:sz="4"/>
+              <w:left w:val="single" w:color="B9C4D0" w:sz="4"/>
+              <w:bottom w:val="single" w:color="B9C4D0" w:sz="4"/>
+              <w:right w:val="single" w:color="B9C4D0" w:sz="4"/>
+            </w:tcBorders>
+            <w:shd w:fill="F2F6FB" w:color="auto" w:val="clear"/>
+            <w:tcMar>
+              <w:top w:type="dxa" w:w="60"/>
+              <w:left w:type="dxa" w:w="100"/>
+              <w:bottom w:type="dxa" w:w="60"/>
+              <w:right w:type="dxa" w:w="100"/>
+            </w:tcMar>
+          </w:tcPr>
+          <w:p>
+            <w:r>
+              <w:rPr>
+                <w:rFonts w:ascii="Calibri" w:cs="Calibri" w:eastAsia="Calibri" w:hAnsi="Calibri"/>
+                <w:sz w:val="20"/>
+                <w:szCs w:val="20"/>
+              </w:rPr>
+              <w:t xml:space="preserve">☐ Incluir   ☐ Não incluir</w:t>
+            </w:r>
+          </w:p>
+        </w:tc>
+      </w:tr>
+      <w:tr>
+        <w:trPr>
+          <w:cantSplit/>
+        </w:trPr>
+        <w:tc>
+          <w:tcPr>
+            <w:tcW w:type="dxa" w:w="500"/>
+            <w:tcBorders>
+              <w:top w:val="single" w:color="B9C4D0" w:sz="4"/>
+              <w:left w:val="single" w:color="B9C4D0" w:sz="4"/>
+              <w:bottom w:val="single" w:color="B9C4D0" w:sz="4"/>
+              <w:right w:val="single" w:color="B9C4D0" w:sz="4"/>
+            </w:tcBorders>
+            <w:tcMar>
+              <w:top w:type="dxa" w:w="60"/>
+              <w:left w:type="dxa" w:w="100"/>
+              <w:bottom w:type="dxa" w:w="60"/>
+              <w:right w:type="dxa" w:w="100"/>
+            </w:tcMar>
+          </w:tcPr>
+          <w:p>
+            <w:r>
+              <w:rPr>
+                <w:rFonts w:ascii="Calibri" w:cs="Calibri" w:eastAsia="Calibri" w:hAnsi="Calibri"/>
+                <w:sz w:val="20"/>
+                <w:szCs w:val="20"/>
+              </w:rPr>
+              <w:t xml:space="preserve">33</w:t>
+            </w:r>
+          </w:p>
+        </w:tc>
+        <w:tc>
+          <w:tcPr>
+            <w:tcW w:type="dxa" w:w="5600"/>
+            <w:tcBorders>
+              <w:top w:val="single" w:color="B9C4D0" w:sz="4"/>
+              <w:left w:val="single" w:color="B9C4D0" w:sz="4"/>
+              <w:bottom w:val="single" w:color="B9C4D0" w:sz="4"/>
+              <w:right w:val="single" w:color="B9C4D0" w:sz="4"/>
+            </w:tcBorders>
+            <w:tcMar>
+              <w:top w:type="dxa" w:w="60"/>
+              <w:left w:type="dxa" w:w="100"/>
+              <w:bottom w:type="dxa" w:w="60"/>
+              <w:right w:type="dxa" w:w="100"/>
+            </w:tcMar>
+          </w:tcPr>
+          <w:p>
+            <w:r>
+              <w:rPr>
+                <w:rFonts w:ascii="Calibri" w:cs="Calibri" w:eastAsia="Calibri" w:hAnsi="Calibri"/>
+                <w:sz w:val="20"/>
+                <w:szCs w:val="20"/>
+              </w:rPr>
+              <w:t xml:space="preserve">CFESS. Nota técnica: problematizando a função da Comissão Técnica de Classificação no contexto do Estado Penal. 2016.</w:t>
+            </w:r>
+          </w:p>
+        </w:tc>
+        <w:tc>
+          <w:tcPr>
+            <w:tcW w:type="dxa" w:w="1400"/>
+            <w:tcBorders>
+              <w:top w:val="single" w:color="B9C4D0" w:sz="4"/>
+              <w:left w:val="single" w:color="B9C4D0" w:sz="4"/>
+              <w:bottom w:val="single" w:color="B9C4D0" w:sz="4"/>
+              <w:right w:val="single" w:color="B9C4D0" w:sz="4"/>
+            </w:tcBorders>
+            <w:tcMar>
+              <w:top w:type="dxa" w:w="60"/>
+              <w:left w:type="dxa" w:w="100"/>
+              <w:bottom w:type="dxa" w:w="60"/>
+              <w:right w:type="dxa" w:w="100"/>
+            </w:tcMar>
+          </w:tcPr>
+          <w:p>
+            <w:r>
+              <w:rPr>
+                <w:rFonts w:ascii="Calibri" w:cs="Calibri" w:eastAsia="Calibri" w:hAnsi="Calibri"/>
+                <w:sz w:val="20"/>
+                <w:szCs w:val="20"/>
+              </w:rPr>
+              <w:t xml:space="preserve">22 p. / 119</w:t>
+            </w:r>
+          </w:p>
+        </w:tc>
+        <w:tc>
+          <w:tcPr>
+            <w:tcW w:type="dxa" w:w="2138"/>
+            <w:tcBorders>
+              <w:top w:val="single" w:color="B9C4D0" w:sz="4"/>
+              <w:left w:val="single" w:color="B9C4D0" w:sz="4"/>
+              <w:bottom w:val="single" w:color="B9C4D0" w:sz="4"/>
+              <w:right w:val="single" w:color="B9C4D0" w:sz="4"/>
+            </w:tcBorders>
+            <w:shd w:fill="F2F6FB" w:color="auto" w:val="clear"/>
+            <w:tcMar>
+              <w:top w:type="dxa" w:w="60"/>
+              <w:left w:type="dxa" w:w="100"/>
+              <w:bottom w:type="dxa" w:w="60"/>
+              <w:right w:type="dxa" w:w="100"/>
+            </w:tcMar>
+          </w:tcPr>
+          <w:p>
+            <w:r>
+              <w:rPr>
+                <w:rFonts w:ascii="Calibri" w:cs="Calibri" w:eastAsia="Calibri" w:hAnsi="Calibri"/>
+                <w:sz w:val="20"/>
+                <w:szCs w:val="20"/>
+              </w:rPr>
+              <w:t xml:space="preserve">☐ Incluir   ☐ Não incluir</w:t>
+            </w:r>
+          </w:p>
+        </w:tc>
+      </w:tr>
+      <w:tr>
+        <w:trPr>
+          <w:cantSplit/>
+        </w:trPr>
+        <w:tc>
+          <w:tcPr>
+            <w:tcW w:type="dxa" w:w="500"/>
+            <w:tcBorders>
+              <w:top w:val="single" w:color="B9C4D0" w:sz="4"/>
+              <w:left w:val="single" w:color="B9C4D0" w:sz="4"/>
+              <w:bottom w:val="single" w:color="B9C4D0" w:sz="4"/>
+              <w:right w:val="single" w:color="B9C4D0" w:sz="4"/>
+            </w:tcBorders>
+            <w:tcMar>
+              <w:top w:type="dxa" w:w="60"/>
+              <w:left w:type="dxa" w:w="100"/>
+              <w:bottom w:type="dxa" w:w="60"/>
+              <w:right w:type="dxa" w:w="100"/>
+            </w:tcMar>
+          </w:tcPr>
+          <w:p>
+            <w:r>
+              <w:rPr>
+                <w:rFonts w:ascii="Calibri" w:cs="Calibri" w:eastAsia="Calibri" w:hAnsi="Calibri"/>
+                <w:sz w:val="20"/>
+                <w:szCs w:val="20"/>
+              </w:rPr>
+              <w:t xml:space="preserve">34</w:t>
+            </w:r>
+          </w:p>
+        </w:tc>
+        <w:tc>
+          <w:tcPr>
+            <w:tcW w:type="dxa" w:w="5600"/>
+            <w:tcBorders>
+              <w:top w:val="single" w:color="B9C4D0" w:sz="4"/>
+              <w:left w:val="single" w:color="B9C4D0" w:sz="4"/>
+              <w:bottom w:val="single" w:color="B9C4D0" w:sz="4"/>
+              <w:right w:val="single" w:color="B9C4D0" w:sz="4"/>
+            </w:tcBorders>
+            <w:tcMar>
+              <w:top w:type="dxa" w:w="60"/>
+              <w:left w:type="dxa" w:w="100"/>
+              <w:bottom w:type="dxa" w:w="60"/>
+              <w:right w:type="dxa" w:w="100"/>
+            </w:tcMar>
+          </w:tcPr>
+          <w:p>
+            <w:r>
+              <w:rPr>
+                <w:rFonts w:ascii="Calibri" w:cs="Calibri" w:eastAsia="Calibri" w:hAnsi="Calibri"/>
+                <w:sz w:val="20"/>
+                <w:szCs w:val="20"/>
+              </w:rPr>
+              <w:t xml:space="preserve">CFESS. Nota técnica acerca da atuação das/os assistentes sociais em comissão de avaliação disciplinar conforme previsão do SINASE. 2016.</w:t>
+            </w:r>
+          </w:p>
+        </w:tc>
+        <w:tc>
+          <w:tcPr>
+            <w:tcW w:type="dxa" w:w="1400"/>
+            <w:tcBorders>
+              <w:top w:val="single" w:color="B9C4D0" w:sz="4"/>
+              <w:left w:val="single" w:color="B9C4D0" w:sz="4"/>
+              <w:bottom w:val="single" w:color="B9C4D0" w:sz="4"/>
+              <w:right w:val="single" w:color="B9C4D0" w:sz="4"/>
+            </w:tcBorders>
+            <w:tcMar>
+              <w:top w:type="dxa" w:w="60"/>
+              <w:left w:type="dxa" w:w="100"/>
+              <w:bottom w:type="dxa" w:w="60"/>
+              <w:right w:type="dxa" w:w="100"/>
+            </w:tcMar>
+          </w:tcPr>
+          <w:p>
+            <w:r>
+              <w:rPr>
+                <w:rFonts w:ascii="Calibri" w:cs="Calibri" w:eastAsia="Calibri" w:hAnsi="Calibri"/>
+                <w:sz w:val="20"/>
+                <w:szCs w:val="20"/>
+              </w:rPr>
+              <w:t xml:space="preserve">32 p. / 131</w:t>
+            </w:r>
+          </w:p>
+        </w:tc>
+        <w:tc>
+          <w:tcPr>
+            <w:tcW w:type="dxa" w:w="2138"/>
+            <w:tcBorders>
+              <w:top w:val="single" w:color="B9C4D0" w:sz="4"/>
+              <w:left w:val="single" w:color="B9C4D0" w:sz="4"/>
+              <w:bottom w:val="single" w:color="B9C4D0" w:sz="4"/>
+              <w:right w:val="single" w:color="B9C4D0" w:sz="4"/>
+            </w:tcBorders>
+            <w:shd w:fill="F2F6FB" w:color="auto" w:val="clear"/>
+            <w:tcMar>
+              <w:top w:type="dxa" w:w="60"/>
+              <w:left w:type="dxa" w:w="100"/>
+              <w:bottom w:type="dxa" w:w="60"/>
+              <w:right w:type="dxa" w:w="100"/>
+            </w:tcMar>
+          </w:tcPr>
+          <w:p>
+            <w:r>
+              <w:rPr>
+                <w:rFonts w:ascii="Calibri" w:cs="Calibri" w:eastAsia="Calibri" w:hAnsi="Calibri"/>
+                <w:sz w:val="20"/>
+                <w:szCs w:val="20"/>
+              </w:rPr>
+              <w:t xml:space="preserve">☐ Incluir   ☐ Não incluir</w:t>
+            </w:r>
+          </w:p>
+        </w:tc>
+      </w:tr>
+      <w:tr>
+        <w:trPr>
+          <w:cantSplit/>
+        </w:trPr>
+        <w:tc>
+          <w:tcPr>
+            <w:tcW w:type="dxa" w:w="500"/>
+            <w:tcBorders>
+              <w:top w:val="single" w:color="B9C4D0" w:sz="4"/>
+              <w:left w:val="single" w:color="B9C4D0" w:sz="4"/>
+              <w:bottom w:val="single" w:color="B9C4D0" w:sz="4"/>
+              <w:right w:val="single" w:color="B9C4D0" w:sz="4"/>
+            </w:tcBorders>
+            <w:tcMar>
+              <w:top w:type="dxa" w:w="60"/>
+              <w:left w:type="dxa" w:w="100"/>
+              <w:bottom w:type="dxa" w:w="60"/>
+              <w:right w:type="dxa" w:w="100"/>
+            </w:tcMar>
+          </w:tcPr>
+          <w:p>
+            <w:r>
+              <w:rPr>
+                <w:rFonts w:ascii="Calibri" w:cs="Calibri" w:eastAsia="Calibri" w:hAnsi="Calibri"/>
+                <w:sz w:val="20"/>
+                <w:szCs w:val="20"/>
+              </w:rPr>
+              <w:t xml:space="preserve">35</w:t>
+            </w:r>
+          </w:p>
+        </w:tc>
+        <w:tc>
+          <w:tcPr>
+            <w:tcW w:type="dxa" w:w="5600"/>
+            <w:tcBorders>
+              <w:top w:val="single" w:color="B9C4D0" w:sz="4"/>
+              <w:left w:val="single" w:color="B9C4D0" w:sz="4"/>
+              <w:bottom w:val="single" w:color="B9C4D0" w:sz="4"/>
+              <w:right w:val="single" w:color="B9C4D0" w:sz="4"/>
+            </w:tcBorders>
+            <w:tcMar>
+              <w:top w:type="dxa" w:w="60"/>
+              <w:left w:type="dxa" w:w="100"/>
+              <w:bottom w:type="dxa" w:w="60"/>
+              <w:right w:type="dxa" w:w="100"/>
+            </w:tcMar>
+          </w:tcPr>
+          <w:p>
+            <w:r>
+              <w:rPr>
+                <w:rFonts w:ascii="Calibri" w:cs="Calibri" w:eastAsia="Calibri" w:hAnsi="Calibri"/>
+                <w:sz w:val="20"/>
+                <w:szCs w:val="20"/>
+              </w:rPr>
+              <w:t xml:space="preserve">CFESS. Nota técnica: considerações sobre a dimensão social presente no processo de reconhecimento de direito ao Benefício de Prestação Continuada (BPC) e a atuação da/o assistente social. 2017.</w:t>
+            </w:r>
+          </w:p>
+        </w:tc>
+        <w:tc>
+          <w:tcPr>
+            <w:tcW w:type="dxa" w:w="1400"/>
+            <w:tcBorders>
+              <w:top w:val="single" w:color="B9C4D0" w:sz="4"/>
+              <w:left w:val="single" w:color="B9C4D0" w:sz="4"/>
+              <w:bottom w:val="single" w:color="B9C4D0" w:sz="4"/>
+              <w:right w:val="single" w:color="B9C4D0" w:sz="4"/>
+            </w:tcBorders>
+            <w:tcMar>
+              <w:top w:type="dxa" w:w="60"/>
+              <w:left w:type="dxa" w:w="100"/>
+              <w:bottom w:type="dxa" w:w="60"/>
+              <w:right w:type="dxa" w:w="100"/>
+            </w:tcMar>
+          </w:tcPr>
+          <w:p>
+            <w:r>
+              <w:rPr>
+                <w:rFonts w:ascii="Calibri" w:cs="Calibri" w:eastAsia="Calibri" w:hAnsi="Calibri"/>
+                <w:sz w:val="20"/>
+                <w:szCs w:val="20"/>
+              </w:rPr>
+              <w:t xml:space="preserve">18 p. / 66</w:t>
+            </w:r>
+          </w:p>
+        </w:tc>
+        <w:tc>
+          <w:tcPr>
+            <w:tcW w:type="dxa" w:w="2138"/>
+            <w:tcBorders>
+              <w:top w:val="single" w:color="B9C4D0" w:sz="4"/>
+              <w:left w:val="single" w:color="B9C4D0" w:sz="4"/>
+              <w:bottom w:val="single" w:color="B9C4D0" w:sz="4"/>
+              <w:right w:val="single" w:color="B9C4D0" w:sz="4"/>
+            </w:tcBorders>
+            <w:shd w:fill="F2F6FB" w:color="auto" w:val="clear"/>
+            <w:tcMar>
+              <w:top w:type="dxa" w:w="60"/>
+              <w:left w:type="dxa" w:w="100"/>
+              <w:bottom w:type="dxa" w:w="60"/>
+              <w:right w:type="dxa" w:w="100"/>
+            </w:tcMar>
+          </w:tcPr>
+          <w:p>
+            <w:r>
+              <w:rPr>
+                <w:rFonts w:ascii="Calibri" w:cs="Calibri" w:eastAsia="Calibri" w:hAnsi="Calibri"/>
+                <w:sz w:val="20"/>
+                <w:szCs w:val="20"/>
+              </w:rPr>
+              <w:t xml:space="preserve">☐ Incluir   ☐ Não incluir</w:t>
+            </w:r>
+          </w:p>
+        </w:tc>
+      </w:tr>
+      <w:tr>
+        <w:trPr>
+          <w:cantSplit/>
+        </w:trPr>
+        <w:tc>
+          <w:tcPr>
+            <w:tcW w:type="dxa" w:w="500"/>
+            <w:tcBorders>
+              <w:top w:val="single" w:color="B9C4D0" w:sz="4"/>
+              <w:left w:val="single" w:color="B9C4D0" w:sz="4"/>
+              <w:bottom w:val="single" w:color="B9C4D0" w:sz="4"/>
+              <w:right w:val="single" w:color="B9C4D0" w:sz="4"/>
+            </w:tcBorders>
+            <w:tcMar>
+              <w:top w:type="dxa" w:w="60"/>
+              <w:left w:type="dxa" w:w="100"/>
+              <w:bottom w:type="dxa" w:w="60"/>
+              <w:right w:type="dxa" w:w="100"/>
+            </w:tcMar>
+          </w:tcPr>
+          <w:p>
+            <w:r>
+              <w:rPr>
+                <w:rFonts w:ascii="Calibri" w:cs="Calibri" w:eastAsia="Calibri" w:hAnsi="Calibri"/>
+                <w:sz w:val="20"/>
+                <w:szCs w:val="20"/>
+              </w:rPr>
+              <w:t xml:space="preserve">36</w:t>
+            </w:r>
+          </w:p>
+        </w:tc>
+        <w:tc>
+          <w:tcPr>
+            <w:tcW w:type="dxa" w:w="5600"/>
+            <w:tcBorders>
+              <w:top w:val="single" w:color="B9C4D0" w:sz="4"/>
+              <w:left w:val="single" w:color="B9C4D0" w:sz="4"/>
+              <w:bottom w:val="single" w:color="B9C4D0" w:sz="4"/>
+              <w:right w:val="single" w:color="B9C4D0" w:sz="4"/>
+            </w:tcBorders>
+            <w:tcMar>
+              <w:top w:type="dxa" w:w="60"/>
+              <w:left w:type="dxa" w:w="100"/>
+              <w:bottom w:type="dxa" w:w="60"/>
+              <w:right w:type="dxa" w:w="100"/>
+            </w:tcMar>
+          </w:tcPr>
+          <w:p>
+            <w:r>
+              <w:rPr>
+                <w:rFonts w:ascii="Calibri" w:cs="Calibri" w:eastAsia="Calibri" w:hAnsi="Calibri"/>
+                <w:sz w:val="20"/>
+                <w:szCs w:val="20"/>
+              </w:rPr>
+              <w:t xml:space="preserve">CFESS. Nota técnica em defesa das atribuições profissionais da(o) assistente social do INSS, do trabalho com autonomia profissional e com garantia das condições técnicas e éticas. 2019.</w:t>
+            </w:r>
+          </w:p>
+        </w:tc>
+        <w:tc>
+          <w:tcPr>
+            <w:tcW w:type="dxa" w:w="1400"/>
+            <w:tcBorders>
+              <w:top w:val="single" w:color="B9C4D0" w:sz="4"/>
+              <w:left w:val="single" w:color="B9C4D0" w:sz="4"/>
+              <w:bottom w:val="single" w:color="B9C4D0" w:sz="4"/>
+              <w:right w:val="single" w:color="B9C4D0" w:sz="4"/>
+            </w:tcBorders>
+            <w:tcMar>
+              <w:top w:type="dxa" w:w="60"/>
+              <w:left w:type="dxa" w:w="100"/>
+              <w:bottom w:type="dxa" w:w="60"/>
+              <w:right w:type="dxa" w:w="100"/>
+            </w:tcMar>
+          </w:tcPr>
+          <w:p>
+            <w:r>
+              <w:rPr>
+                <w:rFonts w:ascii="Calibri" w:cs="Calibri" w:eastAsia="Calibri" w:hAnsi="Calibri"/>
+                <w:sz w:val="20"/>
+                <w:szCs w:val="20"/>
+              </w:rPr>
+              <w:t xml:space="preserve">10 p. / 43</w:t>
+            </w:r>
+          </w:p>
+        </w:tc>
+        <w:tc>
+          <w:tcPr>
+            <w:tcW w:type="dxa" w:w="2138"/>
+            <w:tcBorders>
+              <w:top w:val="single" w:color="B9C4D0" w:sz="4"/>
+              <w:left w:val="single" w:color="B9C4D0" w:sz="4"/>
+              <w:bottom w:val="single" w:color="B9C4D0" w:sz="4"/>
+              <w:right w:val="single" w:color="B9C4D0" w:sz="4"/>
+            </w:tcBorders>
+            <w:shd w:fill="F2F6FB" w:color="auto" w:val="clear"/>
+            <w:tcMar>
+              <w:top w:type="dxa" w:w="60"/>
+              <w:left w:type="dxa" w:w="100"/>
+              <w:bottom w:type="dxa" w:w="60"/>
+              <w:right w:type="dxa" w:w="100"/>
+            </w:tcMar>
+          </w:tcPr>
+          <w:p>
+            <w:r>
+              <w:rPr>
+                <w:rFonts w:ascii="Calibri" w:cs="Calibri" w:eastAsia="Calibri" w:hAnsi="Calibri"/>
+                <w:sz w:val="20"/>
+                <w:szCs w:val="20"/>
+              </w:rPr>
+              <w:t xml:space="preserve">☐ Incluir   ☐ Não incluir</w:t>
+            </w:r>
+          </w:p>
+        </w:tc>
+      </w:tr>
+      <w:tr>
+        <w:trPr>
+          <w:cantSplit/>
+        </w:trPr>
+        <w:tc>
+          <w:tcPr>
+            <w:tcW w:type="dxa" w:w="500"/>
+            <w:tcBorders>
+              <w:top w:val="single" w:color="B9C4D0" w:sz="4"/>
+              <w:left w:val="single" w:color="B9C4D0" w:sz="4"/>
+              <w:bottom w:val="single" w:color="B9C4D0" w:sz="4"/>
+              <w:right w:val="single" w:color="B9C4D0" w:sz="4"/>
+            </w:tcBorders>
+            <w:tcMar>
+              <w:top w:type="dxa" w:w="60"/>
+              <w:left w:type="dxa" w:w="100"/>
+              <w:bottom w:type="dxa" w:w="60"/>
+              <w:right w:type="dxa" w:w="100"/>
+            </w:tcMar>
+          </w:tcPr>
+          <w:p>
+            <w:r>
+              <w:rPr>
+                <w:rFonts w:ascii="Calibri" w:cs="Calibri" w:eastAsia="Calibri" w:hAnsi="Calibri"/>
+                <w:sz w:val="20"/>
+                <w:szCs w:val="20"/>
+              </w:rPr>
+              <w:t xml:space="preserve">37</w:t>
+            </w:r>
+          </w:p>
+        </w:tc>
+        <w:tc>
+          <w:tcPr>
+            <w:tcW w:type="dxa" w:w="5600"/>
+            <w:tcBorders>
+              <w:top w:val="single" w:color="B9C4D0" w:sz="4"/>
+              <w:left w:val="single" w:color="B9C4D0" w:sz="4"/>
+              <w:bottom w:val="single" w:color="B9C4D0" w:sz="4"/>
+              <w:right w:val="single" w:color="B9C4D0" w:sz="4"/>
+            </w:tcBorders>
+            <w:tcMar>
+              <w:top w:type="dxa" w:w="60"/>
+              <w:left w:type="dxa" w:w="100"/>
+              <w:bottom w:type="dxa" w:w="60"/>
+              <w:right w:type="dxa" w:w="100"/>
+            </w:tcMar>
+          </w:tcPr>
+          <w:p>
+            <w:r>
+              <w:rPr>
+                <w:rFonts w:ascii="Calibri" w:cs="Calibri" w:eastAsia="Calibri" w:hAnsi="Calibri"/>
+                <w:sz w:val="20"/>
+                <w:szCs w:val="20"/>
+              </w:rPr>
+              <w:t xml:space="preserve">CFESS. Atuação de assistentes sociais na política urbana: subsídios para reflexão (Série Trabalho e Projeto Profissional nas Políticas Sociais, n. 5). 2016.</w:t>
+            </w:r>
+          </w:p>
+        </w:tc>
+        <w:tc>
+          <w:tcPr>
+            <w:tcW w:type="dxa" w:w="1400"/>
+            <w:tcBorders>
+              <w:top w:val="single" w:color="B9C4D0" w:sz="4"/>
+              <w:left w:val="single" w:color="B9C4D0" w:sz="4"/>
+              <w:bottom w:val="single" w:color="B9C4D0" w:sz="4"/>
+              <w:right w:val="single" w:color="B9C4D0" w:sz="4"/>
+            </w:tcBorders>
+            <w:tcMar>
+              <w:top w:type="dxa" w:w="60"/>
+              <w:left w:type="dxa" w:w="100"/>
+              <w:bottom w:type="dxa" w:w="60"/>
+              <w:right w:type="dxa" w:w="100"/>
+            </w:tcMar>
+          </w:tcPr>
+          <w:p>
+            <w:r>
+              <w:rPr>
+                <w:rFonts w:ascii="Calibri" w:cs="Calibri" w:eastAsia="Calibri" w:hAnsi="Calibri"/>
+                <w:sz w:val="20"/>
+                <w:szCs w:val="20"/>
+              </w:rPr>
+              <w:t xml:space="preserve">66 p. / 206</w:t>
+            </w:r>
+          </w:p>
+        </w:tc>
+        <w:tc>
+          <w:tcPr>
+            <w:tcW w:type="dxa" w:w="2138"/>
+            <w:tcBorders>
+              <w:top w:val="single" w:color="B9C4D0" w:sz="4"/>
+              <w:left w:val="single" w:color="B9C4D0" w:sz="4"/>
+              <w:bottom w:val="single" w:color="B9C4D0" w:sz="4"/>
+              <w:right w:val="single" w:color="B9C4D0" w:sz="4"/>
+            </w:tcBorders>
+            <w:shd w:fill="F2F6FB" w:color="auto" w:val="clear"/>
+            <w:tcMar>
+              <w:top w:type="dxa" w:w="60"/>
+              <w:left w:type="dxa" w:w="100"/>
+              <w:bottom w:type="dxa" w:w="60"/>
+              <w:right w:type="dxa" w:w="100"/>
+            </w:tcMar>
+          </w:tcPr>
+          <w:p>
+            <w:r>
+              <w:rPr>
+                <w:rFonts w:ascii="Calibri" w:cs="Calibri" w:eastAsia="Calibri" w:hAnsi="Calibri"/>
+                <w:sz w:val="20"/>
+                <w:szCs w:val="20"/>
+              </w:rPr>
+              <w:t xml:space="preserve">☐ Incluir   ☐ Não incluir</w:t>
+            </w:r>
+          </w:p>
+        </w:tc>
+      </w:tr>
+      <w:tr>
+        <w:trPr>
+          <w:cantSplit/>
+        </w:trPr>
+        <w:tc>
+          <w:tcPr>
+            <w:tcW w:type="dxa" w:w="500"/>
+            <w:tcBorders>
+              <w:top w:val="single" w:color="B9C4D0" w:sz="4"/>
+              <w:left w:val="single" w:color="B9C4D0" w:sz="4"/>
+              <w:bottom w:val="single" w:color="B9C4D0" w:sz="4"/>
+              <w:right w:val="single" w:color="B9C4D0" w:sz="4"/>
+            </w:tcBorders>
+            <w:tcMar>
+              <w:top w:type="dxa" w:w="60"/>
+              <w:left w:type="dxa" w:w="100"/>
+              <w:bottom w:type="dxa" w:w="60"/>
+              <w:right w:type="dxa" w:w="100"/>
+            </w:tcMar>
+          </w:tcPr>
+          <w:p>
+            <w:r>
+              <w:rPr>
+                <w:rFonts w:ascii="Calibri" w:cs="Calibri" w:eastAsia="Calibri" w:hAnsi="Calibri"/>
+                <w:sz w:val="20"/>
+                <w:szCs w:val="20"/>
+              </w:rPr>
+              <w:t xml:space="preserve">38</w:t>
+            </w:r>
+          </w:p>
+        </w:tc>
+        <w:tc>
+          <w:tcPr>
+            <w:tcW w:type="dxa" w:w="5600"/>
+            <w:tcBorders>
+              <w:top w:val="single" w:color="B9C4D0" w:sz="4"/>
+              <w:left w:val="single" w:color="B9C4D0" w:sz="4"/>
+              <w:bottom w:val="single" w:color="B9C4D0" w:sz="4"/>
+              <w:right w:val="single" w:color="B9C4D0" w:sz="4"/>
+            </w:tcBorders>
+            <w:tcMar>
+              <w:top w:type="dxa" w:w="60"/>
+              <w:left w:type="dxa" w:w="100"/>
+              <w:bottom w:type="dxa" w:w="60"/>
+              <w:right w:type="dxa" w:w="100"/>
+            </w:tcMar>
+          </w:tcPr>
+          <w:p>
+            <w:r>
+              <w:rPr>
+                <w:rFonts w:ascii="Calibri" w:cs="Calibri" w:eastAsia="Calibri" w:hAnsi="Calibri"/>
+                <w:sz w:val="20"/>
+                <w:szCs w:val="20"/>
+              </w:rPr>
+              <w:t xml:space="preserve">CFESS. Psicólogas(os) e assistentes sociais na rede pública de educação básica: orientações para regulamentação da Lei 13.935, de 2019. 2020.</w:t>
+            </w:r>
+          </w:p>
+        </w:tc>
+        <w:tc>
+          <w:tcPr>
+            <w:tcW w:type="dxa" w:w="1400"/>
+            <w:tcBorders>
+              <w:top w:val="single" w:color="B9C4D0" w:sz="4"/>
+              <w:left w:val="single" w:color="B9C4D0" w:sz="4"/>
+              <w:bottom w:val="single" w:color="B9C4D0" w:sz="4"/>
+              <w:right w:val="single" w:color="B9C4D0" w:sz="4"/>
+            </w:tcBorders>
+            <w:tcMar>
+              <w:top w:type="dxa" w:w="60"/>
+              <w:left w:type="dxa" w:w="100"/>
+              <w:bottom w:type="dxa" w:w="60"/>
+              <w:right w:type="dxa" w:w="100"/>
+            </w:tcMar>
+          </w:tcPr>
+          <w:p>
+            <w:r>
+              <w:rPr>
+                <w:rFonts w:ascii="Calibri" w:cs="Calibri" w:eastAsia="Calibri" w:hAnsi="Calibri"/>
+                <w:sz w:val="20"/>
+                <w:szCs w:val="20"/>
+              </w:rPr>
+              <w:t xml:space="preserve">46 p. / 137</w:t>
+            </w:r>
+          </w:p>
+        </w:tc>
+        <w:tc>
+          <w:tcPr>
+            <w:tcW w:type="dxa" w:w="2138"/>
+            <w:tcBorders>
+              <w:top w:val="single" w:color="B9C4D0" w:sz="4"/>
+              <w:left w:val="single" w:color="B9C4D0" w:sz="4"/>
+              <w:bottom w:val="single" w:color="B9C4D0" w:sz="4"/>
+              <w:right w:val="single" w:color="B9C4D0" w:sz="4"/>
+            </w:tcBorders>
+            <w:shd w:fill="F2F6FB" w:color="auto" w:val="clear"/>
+            <w:tcMar>
+              <w:top w:type="dxa" w:w="60"/>
+              <w:left w:type="dxa" w:w="100"/>
+              <w:bottom w:type="dxa" w:w="60"/>
+              <w:right w:type="dxa" w:w="100"/>
+            </w:tcMar>
+          </w:tcPr>
+          <w:p>
+            <w:r>
+              <w:rPr>
+                <w:rFonts w:ascii="Calibri" w:cs="Calibri" w:eastAsia="Calibri" w:hAnsi="Calibri"/>
+                <w:sz w:val="20"/>
+                <w:szCs w:val="20"/>
+              </w:rPr>
+              <w:t xml:space="preserve">☐ Incluir   ☐ Não incluir</w:t>
+            </w:r>
+          </w:p>
+        </w:tc>
+      </w:tr>
+      <w:tr>
+        <w:trPr>
+          <w:cantSplit/>
+        </w:trPr>
+        <w:tc>
+          <w:tcPr>
+            <w:tcW w:type="dxa" w:w="500"/>
+            <w:tcBorders>
+              <w:top w:val="single" w:color="B9C4D0" w:sz="4"/>
+              <w:left w:val="single" w:color="B9C4D0" w:sz="4"/>
+              <w:bottom w:val="single" w:color="B9C4D0" w:sz="4"/>
+              <w:right w:val="single" w:color="B9C4D0" w:sz="4"/>
+            </w:tcBorders>
+            <w:tcMar>
+              <w:top w:type="dxa" w:w="60"/>
+              <w:left w:type="dxa" w:w="100"/>
+              <w:bottom w:type="dxa" w:w="60"/>
+              <w:right w:type="dxa" w:w="100"/>
+            </w:tcMar>
+          </w:tcPr>
+          <w:p>
+            <w:r>
+              <w:rPr>
+                <w:rFonts w:ascii="Calibri" w:cs="Calibri" w:eastAsia="Calibri" w:hAnsi="Calibri"/>
+                <w:sz w:val="20"/>
+                <w:szCs w:val="20"/>
+              </w:rPr>
+              <w:t xml:space="preserve">39</w:t>
+            </w:r>
+          </w:p>
+        </w:tc>
+        <w:tc>
+          <w:tcPr>
+            <w:tcW w:type="dxa" w:w="5600"/>
+            <w:tcBorders>
+              <w:top w:val="single" w:color="B9C4D0" w:sz="4"/>
+              <w:left w:val="single" w:color="B9C4D0" w:sz="4"/>
+              <w:bottom w:val="single" w:color="B9C4D0" w:sz="4"/>
+              <w:right w:val="single" w:color="B9C4D0" w:sz="4"/>
+            </w:tcBorders>
+            <w:tcMar>
+              <w:top w:type="dxa" w:w="60"/>
+              <w:left w:type="dxa" w:w="100"/>
+              <w:bottom w:type="dxa" w:w="60"/>
+              <w:right w:type="dxa" w:w="100"/>
+            </w:tcMar>
+          </w:tcPr>
+          <w:p>
+            <w:r>
+              <w:rPr>
+                <w:rFonts w:ascii="Calibri" w:cs="Calibri" w:eastAsia="Calibri" w:hAnsi="Calibri"/>
+                <w:sz w:val="20"/>
+                <w:szCs w:val="20"/>
+              </w:rPr>
+              <w:t xml:space="preserve">CFESS. Manifestação interinstitucional sobre a residência em Serviço Social em unidades do Ministério Público e Tribunais de Justiça. 2024.</w:t>
+            </w:r>
+          </w:p>
+        </w:tc>
+        <w:tc>
+          <w:tcPr>
+            <w:tcW w:type="dxa" w:w="1400"/>
+            <w:tcBorders>
+              <w:top w:val="single" w:color="B9C4D0" w:sz="4"/>
+              <w:left w:val="single" w:color="B9C4D0" w:sz="4"/>
+              <w:bottom w:val="single" w:color="B9C4D0" w:sz="4"/>
+              <w:right w:val="single" w:color="B9C4D0" w:sz="4"/>
+            </w:tcBorders>
+            <w:tcMar>
+              <w:top w:type="dxa" w:w="60"/>
+              <w:left w:type="dxa" w:w="100"/>
+              <w:bottom w:type="dxa" w:w="60"/>
+              <w:right w:type="dxa" w:w="100"/>
+            </w:tcMar>
+          </w:tcPr>
+          <w:p>
+            <w:r>
+              <w:rPr>
+                <w:rFonts w:ascii="Calibri" w:cs="Calibri" w:eastAsia="Calibri" w:hAnsi="Calibri"/>
+                <w:sz w:val="20"/>
+                <w:szCs w:val="20"/>
+              </w:rPr>
+              <w:t xml:space="preserve">6 p. / 32</w:t>
             </w:r>
           </w:p>
         </w:tc>

</xml_diff>